<commit_message>
Initial commit - FAST Project setup
</commit_message>
<xml_diff>
--- a/הצגת רעיון לפרויקט גמר.docx
+++ b/הצגת רעיון לפרויקט גמר.docx
@@ -49,9 +49,21 @@
           <w:u w:val="single"/>
           <w:rtl/>
         </w:rPr>
-        <w:t xml:space="preserve">תומר </w:t>
-      </w:r>
-      <w:proofErr w:type="spellStart"/>
+        <w:t>תומר סטויאנוב 209491752</w:t>
+      </w:r>
+    </w:p>
+    <w:p>
+      <w:pPr>
+        <w:jc w:val="center"/>
+        <w:rPr>
+          <w:b/>
+          <w:bCs/>
+          <w:sz w:val="32"/>
+          <w:szCs w:val="32"/>
+          <w:u w:val="single"/>
+          <w:rtl/>
+        </w:rPr>
+      </w:pPr>
       <w:r>
         <w:rPr>
           <w:rFonts w:hint="cs"/>
@@ -62,71 +74,7 @@
           <w:u w:val="single"/>
           <w:rtl/>
         </w:rPr>
-        <w:t>סטויאנוב</w:t>
-      </w:r>
-      <w:proofErr w:type="spellEnd"/>
-      <w:r>
-        <w:rPr>
-          <w:rFonts w:hint="cs"/>
-          <w:b/>
-          <w:bCs/>
-          <w:sz w:val="32"/>
-          <w:szCs w:val="32"/>
-          <w:u w:val="single"/>
-          <w:rtl/>
-        </w:rPr>
-        <w:t xml:space="preserve"> 209491752</w:t>
-      </w:r>
-    </w:p>
-    <w:p>
-      <w:pPr>
-        <w:jc w:val="center"/>
-        <w:rPr>
-          <w:b/>
-          <w:bCs/>
-          <w:sz w:val="32"/>
-          <w:szCs w:val="32"/>
-          <w:u w:val="single"/>
-          <w:rtl/>
-        </w:rPr>
-      </w:pPr>
-      <w:r>
-        <w:rPr>
-          <w:rFonts w:hint="cs"/>
-          <w:b/>
-          <w:bCs/>
-          <w:sz w:val="32"/>
-          <w:szCs w:val="32"/>
-          <w:u w:val="single"/>
-          <w:rtl/>
-        </w:rPr>
-        <w:t xml:space="preserve">זיו </w:t>
-      </w:r>
-      <w:proofErr w:type="spellStart"/>
-      <w:r>
-        <w:rPr>
-          <w:rFonts w:hint="cs"/>
-          <w:b/>
-          <w:bCs/>
-          <w:sz w:val="32"/>
-          <w:szCs w:val="32"/>
-          <w:u w:val="single"/>
-          <w:rtl/>
-        </w:rPr>
-        <w:t>גוהסי</w:t>
-      </w:r>
-      <w:proofErr w:type="spellEnd"/>
-      <w:r>
-        <w:rPr>
-          <w:rFonts w:hint="cs"/>
-          <w:b/>
-          <w:bCs/>
-          <w:sz w:val="32"/>
-          <w:szCs w:val="32"/>
-          <w:u w:val="single"/>
-          <w:rtl/>
-        </w:rPr>
-        <w:t xml:space="preserve"> 211541271</w:t>
+        <w:t>זיו גוהסי 211541271</w:t>
       </w:r>
     </w:p>
     <w:p>
@@ -143,7 +91,7 @@
           <w:szCs w:val="28"/>
           <w:rtl/>
         </w:rPr>
-        <w:t>מערכת הפרויקט היא מערכת ניווט חכמה לרכבי חירום והצלה (אמבולנסים, ניידות, כבאיות) שמטרתה להביא את הצוות למיקום האירוע בזמן הקצר ביותר, תוך התאמה ייעודית לאופי הנהיגה שלהם</w:t>
+        <w:t>מערכת הפרויקט היא מערכת ניווט חכמה לרכבי חירום והצלה (אמבולנסים) שמטרתה להביא את הצוות למיקום האירוע בזמן הקצר ביותר, תוך התאמה ייעודית לאופי הנהיגה שלהם</w:t>
       </w:r>
       <w:r>
         <w:rPr>
@@ -969,6 +917,7 @@
   <w:style w:type="character" w:default="1" w:styleId="DefaultParagraphFont">
     <w:name w:val="Default Paragraph Font"/>
     <w:uiPriority w:val="1"/>
+    <w:semiHidden/>
     <w:unhideWhenUsed/>
   </w:style>
   <w:style w:type="table" w:default="1" w:styleId="TableNormal">

</xml_diff>